<commit_message>
feat: complete closure documents and withdrawal drafts
</commit_message>
<xml_diff>
--- a/backend/api/resources/templates/withdrawals/DRAFT.docx
+++ b/backend/api/resources/templates/withdrawals/DRAFT.docx
@@ -270,7 +270,30 @@
           <w:rFonts w:ascii="Times New Roman" w:hAnsi="Times New Roman" w:cs="Times New Roman"/>
           <w:color w:val="000000" w:themeColor="text1"/>
         </w:rPr>
-        <w:t>: ……………………………………………………….</w:t>
+        <w:t xml:space="preserve">: </w:t>
+      </w:r>
+      <w:r>
+        <w:rPr>
+          <w:rFonts w:ascii="Times New Roman" w:hAnsi="Times New Roman" w:cs="Times New Roman"/>
+          <w:color w:val="000000" w:themeColor="text1"/>
+        </w:rPr>
+        <w:t>{{</w:t>
+      </w:r>
+      <w:proofErr w:type="spellStart"/>
+      <w:r>
+        <w:rPr>
+          <w:rFonts w:ascii="Times New Roman" w:hAnsi="Times New Roman" w:cs="Times New Roman"/>
+          <w:color w:val="000000" w:themeColor="text1"/>
+        </w:rPr>
+        <w:t>nama_akun_pelapor</w:t>
+      </w:r>
+      <w:proofErr w:type="spellEnd"/>
+      <w:r>
+        <w:rPr>
+          <w:rFonts w:ascii="Times New Roman" w:hAnsi="Times New Roman" w:cs="Times New Roman"/>
+          <w:color w:val="000000" w:themeColor="text1"/>
+        </w:rPr>
+        <w:t>}}</w:t>
       </w:r>
     </w:p>
     <w:p>
@@ -337,7 +360,30 @@
           <w:rFonts w:ascii="Times New Roman" w:hAnsi="Times New Roman" w:cs="Times New Roman"/>
           <w:color w:val="000000" w:themeColor="text1"/>
         </w:rPr>
-        <w:t>: ……………………………………………………….</w:t>
+        <w:t xml:space="preserve">: </w:t>
+      </w:r>
+      <w:r>
+        <w:rPr>
+          <w:rFonts w:ascii="Times New Roman" w:hAnsi="Times New Roman" w:cs="Times New Roman"/>
+          <w:color w:val="000000" w:themeColor="text1"/>
+        </w:rPr>
+        <w:t>{{</w:t>
+      </w:r>
+      <w:proofErr w:type="spellStart"/>
+      <w:r>
+        <w:rPr>
+          <w:rFonts w:ascii="Times New Roman" w:hAnsi="Times New Roman" w:cs="Times New Roman"/>
+          <w:color w:val="000000" w:themeColor="text1"/>
+        </w:rPr>
+        <w:t>nim_pelapor</w:t>
+      </w:r>
+      <w:proofErr w:type="spellEnd"/>
+      <w:r>
+        <w:rPr>
+          <w:rFonts w:ascii="Times New Roman" w:hAnsi="Times New Roman" w:cs="Times New Roman"/>
+          <w:color w:val="000000" w:themeColor="text1"/>
+        </w:rPr>
+        <w:t>}}</w:t>
       </w:r>
     </w:p>
     <w:p>
@@ -401,115 +447,29 @@
         </w:rPr>
         <w:t xml:space="preserve"> </w:t>
       </w:r>
-      <w:proofErr w:type="spellStart"/>
-      <w:r>
-        <w:rPr>
-          <w:rFonts w:ascii="Times New Roman" w:hAnsi="Times New Roman" w:cs="Times New Roman"/>
-          <w:color w:val="000000" w:themeColor="text1"/>
-        </w:rPr>
-        <w:t>Mahasiswa</w:t>
-      </w:r>
-      <w:proofErr w:type="spellEnd"/>
-      <w:r>
-        <w:rPr>
-          <w:rFonts w:ascii="Times New Roman" w:hAnsi="Times New Roman" w:cs="Times New Roman"/>
-          <w:color w:val="000000" w:themeColor="text1"/>
-        </w:rPr>
-        <w:t xml:space="preserve"> </w:t>
-      </w:r>
-      <w:r>
-        <w:rPr>
-          <w:rFonts w:ascii="Times New Roman" w:hAnsi="Times New Roman" w:cs="Times New Roman"/>
-          <w:color w:val="000000" w:themeColor="text1"/>
-          <w:lang w:val="id-ID"/>
-        </w:rPr>
-        <w:t>/</w:t>
-      </w:r>
-      <w:r>
-        <w:rPr>
-          <w:rFonts w:ascii="Times New Roman" w:hAnsi="Times New Roman" w:cs="Times New Roman"/>
-          <w:color w:val="000000" w:themeColor="text1"/>
-        </w:rPr>
-        <w:t xml:space="preserve"> </w:t>
-      </w:r>
-      <w:proofErr w:type="spellStart"/>
-      <w:r>
-        <w:rPr>
-          <w:rFonts w:ascii="Times New Roman" w:hAnsi="Times New Roman" w:cs="Times New Roman"/>
-          <w:color w:val="000000" w:themeColor="text1"/>
-        </w:rPr>
-        <w:t>Dosen</w:t>
-      </w:r>
-      <w:proofErr w:type="spellEnd"/>
-      <w:r>
-        <w:rPr>
-          <w:rFonts w:ascii="Times New Roman" w:hAnsi="Times New Roman" w:cs="Times New Roman"/>
-          <w:color w:val="000000" w:themeColor="text1"/>
-        </w:rPr>
-        <w:t xml:space="preserve"> </w:t>
-      </w:r>
-      <w:r>
-        <w:rPr>
-          <w:rFonts w:ascii="Times New Roman" w:hAnsi="Times New Roman" w:cs="Times New Roman"/>
-          <w:color w:val="000000" w:themeColor="text1"/>
-          <w:lang w:val="id-ID"/>
-        </w:rPr>
-        <w:t>/</w:t>
-      </w:r>
-      <w:r>
-        <w:rPr>
-          <w:rFonts w:ascii="Times New Roman" w:hAnsi="Times New Roman" w:cs="Times New Roman"/>
-          <w:color w:val="000000" w:themeColor="text1"/>
-        </w:rPr>
-        <w:t xml:space="preserve"> </w:t>
-      </w:r>
-      <w:r>
-        <w:rPr>
-          <w:rFonts w:ascii="Times New Roman" w:hAnsi="Times New Roman" w:cs="Times New Roman"/>
-          <w:color w:val="000000" w:themeColor="text1"/>
-        </w:rPr>
-        <w:t xml:space="preserve">Tenaga </w:t>
-      </w:r>
-      <w:proofErr w:type="spellStart"/>
-      <w:r>
-        <w:rPr>
-          <w:rFonts w:ascii="Times New Roman" w:hAnsi="Times New Roman" w:cs="Times New Roman"/>
-          <w:color w:val="000000" w:themeColor="text1"/>
-        </w:rPr>
-        <w:t>Kependidikan</w:t>
-      </w:r>
-      <w:proofErr w:type="spellEnd"/>
-      <w:r>
-        <w:rPr>
-          <w:rFonts w:ascii="Times New Roman" w:hAnsi="Times New Roman" w:cs="Times New Roman"/>
-          <w:color w:val="000000" w:themeColor="text1"/>
-        </w:rPr>
-        <w:t xml:space="preserve"> </w:t>
-      </w:r>
-      <w:r>
-        <w:rPr>
-          <w:rFonts w:ascii="Times New Roman" w:hAnsi="Times New Roman" w:cs="Times New Roman"/>
-          <w:color w:val="000000" w:themeColor="text1"/>
-          <w:lang w:val="id-ID"/>
-        </w:rPr>
-        <w:t>/</w:t>
-      </w:r>
-      <w:r>
-        <w:rPr>
-          <w:rFonts w:ascii="Times New Roman" w:hAnsi="Times New Roman" w:cs="Times New Roman"/>
-          <w:color w:val="000000" w:themeColor="text1"/>
-        </w:rPr>
-        <w:t xml:space="preserve"> </w:t>
-      </w:r>
-      <w:proofErr w:type="spellStart"/>
-      <w:r>
-        <w:rPr>
-          <w:rFonts w:ascii="Times New Roman" w:hAnsi="Times New Roman" w:cs="Times New Roman"/>
-          <w:color w:val="000000" w:themeColor="text1"/>
-        </w:rPr>
-        <w:t>Lainnya</w:t>
-      </w:r>
-      <w:proofErr w:type="spellEnd"/>
+      <w:r>
+        <w:rPr>
+          <w:rFonts w:ascii="Times New Roman" w:hAnsi="Times New Roman" w:cs="Times New Roman"/>
+          <w:color w:val="000000" w:themeColor="text1"/>
+        </w:rPr>
+        <w:t>{{</w:t>
+      </w:r>
+      <w:proofErr w:type="spellStart"/>
+      <w:r>
+        <w:rPr>
+          <w:rFonts w:ascii="Times New Roman" w:hAnsi="Times New Roman" w:cs="Times New Roman"/>
+          <w:color w:val="000000" w:themeColor="text1"/>
+        </w:rPr>
+        <w:t>status_akun_pelapor</w:t>
+      </w:r>
+      <w:proofErr w:type="spellEnd"/>
+      <w:r>
+        <w:rPr>
+          <w:rFonts w:ascii="Times New Roman" w:hAnsi="Times New Roman" w:cs="Times New Roman"/>
+          <w:color w:val="000000" w:themeColor="text1"/>
+        </w:rPr>
+        <w:t>}}</w:t>
+      </w:r>
     </w:p>
     <w:p>
       <w:pPr>
@@ -572,7 +532,30 @@
           <w:rFonts w:ascii="Times New Roman" w:hAnsi="Times New Roman" w:cs="Times New Roman"/>
           <w:color w:val="000000" w:themeColor="text1"/>
         </w:rPr>
-        <w:t>: ……………………………………………………….</w:t>
+        <w:t xml:space="preserve">: </w:t>
+      </w:r>
+      <w:r>
+        <w:rPr>
+          <w:rFonts w:ascii="Times New Roman" w:hAnsi="Times New Roman" w:cs="Times New Roman"/>
+          <w:color w:val="000000" w:themeColor="text1"/>
+        </w:rPr>
+        <w:t>{{</w:t>
+      </w:r>
+      <w:proofErr w:type="spellStart"/>
+      <w:r>
+        <w:rPr>
+          <w:rFonts w:ascii="Times New Roman" w:hAnsi="Times New Roman" w:cs="Times New Roman"/>
+          <w:color w:val="000000" w:themeColor="text1"/>
+        </w:rPr>
+        <w:t>program_studi_pelapor</w:t>
+      </w:r>
+      <w:proofErr w:type="spellEnd"/>
+      <w:r>
+        <w:rPr>
+          <w:rFonts w:ascii="Times New Roman" w:hAnsi="Times New Roman" w:cs="Times New Roman"/>
+          <w:color w:val="000000" w:themeColor="text1"/>
+        </w:rPr>
+        <w:t>}}</w:t>
       </w:r>
     </w:p>
     <w:p>
@@ -619,7 +602,30 @@
           <w:rFonts w:ascii="Times New Roman" w:hAnsi="Times New Roman" w:cs="Times New Roman"/>
           <w:color w:val="000000" w:themeColor="text1"/>
         </w:rPr>
-        <w:t>: ……………………………………………………….</w:t>
+        <w:t xml:space="preserve">: </w:t>
+      </w:r>
+      <w:r>
+        <w:rPr>
+          <w:rFonts w:ascii="Times New Roman" w:hAnsi="Times New Roman" w:cs="Times New Roman"/>
+          <w:color w:val="000000" w:themeColor="text1"/>
+        </w:rPr>
+        <w:t>{{</w:t>
+      </w:r>
+      <w:proofErr w:type="spellStart"/>
+      <w:r>
+        <w:rPr>
+          <w:rFonts w:ascii="Times New Roman" w:hAnsi="Times New Roman" w:cs="Times New Roman"/>
+          <w:color w:val="000000" w:themeColor="text1"/>
+        </w:rPr>
+        <w:t>alamat_pelapor</w:t>
+      </w:r>
+      <w:proofErr w:type="spellEnd"/>
+      <w:r>
+        <w:rPr>
+          <w:rFonts w:ascii="Times New Roman" w:hAnsi="Times New Roman" w:cs="Times New Roman"/>
+          <w:color w:val="000000" w:themeColor="text1"/>
+        </w:rPr>
+        <w:t>}}</w:t>
       </w:r>
     </w:p>
     <w:p>
@@ -688,7 +694,30 @@
           <w:rFonts w:ascii="Times New Roman" w:hAnsi="Times New Roman" w:cs="Times New Roman"/>
           <w:color w:val="000000" w:themeColor="text1"/>
         </w:rPr>
-        <w:t>: ……………………………………………………….</w:t>
+        <w:t xml:space="preserve">: </w:t>
+      </w:r>
+      <w:r>
+        <w:rPr>
+          <w:rFonts w:ascii="Times New Roman" w:hAnsi="Times New Roman" w:cs="Times New Roman"/>
+          <w:color w:val="000000" w:themeColor="text1"/>
+        </w:rPr>
+        <w:t>{{</w:t>
+      </w:r>
+      <w:proofErr w:type="spellStart"/>
+      <w:r>
+        <w:rPr>
+          <w:rFonts w:ascii="Times New Roman" w:hAnsi="Times New Roman" w:cs="Times New Roman"/>
+          <w:color w:val="000000" w:themeColor="text1"/>
+        </w:rPr>
+        <w:t>nomor_telepon_pelapor</w:t>
+      </w:r>
+      <w:proofErr w:type="spellEnd"/>
+      <w:r>
+        <w:rPr>
+          <w:rFonts w:ascii="Times New Roman" w:hAnsi="Times New Roman" w:cs="Times New Roman"/>
+          <w:color w:val="000000" w:themeColor="text1"/>
+        </w:rPr>
+        <w:t>}}</w:t>
       </w:r>
     </w:p>
     <w:p>
@@ -1291,7 +1320,30 @@
           <w:rFonts w:ascii="Times New Roman" w:hAnsi="Times New Roman" w:cs="Times New Roman"/>
           <w:color w:val="000000" w:themeColor="text1"/>
         </w:rPr>
-        <w:t>: ………………………………</w:t>
+        <w:t xml:space="preserve">: </w:t>
+      </w:r>
+      <w:r>
+        <w:rPr>
+          <w:rFonts w:ascii="Times New Roman" w:hAnsi="Times New Roman" w:cs="Times New Roman"/>
+          <w:color w:val="000000" w:themeColor="text1"/>
+        </w:rPr>
+        <w:t>{{</w:t>
+      </w:r>
+      <w:proofErr w:type="spellStart"/>
+      <w:r>
+        <w:rPr>
+          <w:rFonts w:ascii="Times New Roman" w:hAnsi="Times New Roman" w:cs="Times New Roman"/>
+          <w:color w:val="000000" w:themeColor="text1"/>
+        </w:rPr>
+        <w:t>nomor_laporan</w:t>
+      </w:r>
+      <w:proofErr w:type="spellEnd"/>
+      <w:r>
+        <w:rPr>
+          <w:rFonts w:ascii="Times New Roman" w:hAnsi="Times New Roman" w:cs="Times New Roman"/>
+          <w:color w:val="000000" w:themeColor="text1"/>
+        </w:rPr>
+        <w:t>}}</w:t>
       </w:r>
     </w:p>
     <w:p>
@@ -1358,7 +1410,30 @@
           <w:rFonts w:ascii="Times New Roman" w:hAnsi="Times New Roman" w:cs="Times New Roman"/>
           <w:color w:val="000000" w:themeColor="text1"/>
         </w:rPr>
-        <w:t>: ………………………………</w:t>
+        <w:t xml:space="preserve">: </w:t>
+      </w:r>
+      <w:r>
+        <w:rPr>
+          <w:rFonts w:ascii="Times New Roman" w:hAnsi="Times New Roman" w:cs="Times New Roman"/>
+          <w:color w:val="000000" w:themeColor="text1"/>
+        </w:rPr>
+        <w:t>{{</w:t>
+      </w:r>
+      <w:proofErr w:type="spellStart"/>
+      <w:r>
+        <w:rPr>
+          <w:rFonts w:ascii="Times New Roman" w:hAnsi="Times New Roman" w:cs="Times New Roman"/>
+          <w:color w:val="000000" w:themeColor="text1"/>
+        </w:rPr>
+        <w:t>tanggal_pelaporan</w:t>
+      </w:r>
+      <w:proofErr w:type="spellEnd"/>
+      <w:r>
+        <w:rPr>
+          <w:rFonts w:ascii="Times New Roman" w:hAnsi="Times New Roman" w:cs="Times New Roman"/>
+          <w:color w:val="000000" w:themeColor="text1"/>
+        </w:rPr>
+        <w:t>}}</w:t>
       </w:r>
     </w:p>
     <w:p>
@@ -1993,17 +2068,109 @@
           <w:rFonts w:ascii="Times New Roman" w:hAnsi="Times New Roman" w:cs="Times New Roman"/>
           <w:color w:val="000000" w:themeColor="text1"/>
         </w:rPr>
-        <w:t>…………………………………, …………….. 20</w:t>
-      </w:r>
-      <w:proofErr w:type="gramStart"/>
-      <w:r>
-        <w:rPr>
-          <w:rFonts w:ascii="Times New Roman" w:hAnsi="Times New Roman" w:cs="Times New Roman"/>
-          <w:color w:val="000000" w:themeColor="text1"/>
-        </w:rPr>
-        <w:t>…..</w:t>
-      </w:r>
-      <w:proofErr w:type="gramEnd"/>
+        <w:t>{{</w:t>
+      </w:r>
+      <w:proofErr w:type="spellStart"/>
+      <w:r>
+        <w:rPr>
+          <w:rFonts w:ascii="Times New Roman" w:hAnsi="Times New Roman" w:cs="Times New Roman"/>
+          <w:color w:val="000000" w:themeColor="text1"/>
+        </w:rPr>
+        <w:t>alamat_pelapor</w:t>
+      </w:r>
+      <w:proofErr w:type="spellEnd"/>
+      <w:r>
+        <w:rPr>
+          <w:rFonts w:ascii="Times New Roman" w:hAnsi="Times New Roman" w:cs="Times New Roman"/>
+          <w:color w:val="000000" w:themeColor="text1"/>
+        </w:rPr>
+        <w:t>}}</w:t>
+      </w:r>
+      <w:r>
+        <w:rPr>
+          <w:rFonts w:ascii="Times New Roman" w:hAnsi="Times New Roman" w:cs="Times New Roman"/>
+          <w:color w:val="000000" w:themeColor="text1"/>
+        </w:rPr>
+        <w:t>,.</w:t>
+      </w:r>
+      <w:r>
+        <w:rPr>
+          <w:rFonts w:ascii="Times New Roman" w:hAnsi="Times New Roman" w:cs="Times New Roman"/>
+          <w:color w:val="000000" w:themeColor="text1"/>
+        </w:rPr>
+        <w:t xml:space="preserve"> </w:t>
+      </w:r>
+      <w:r>
+        <w:rPr>
+          <w:rFonts w:ascii="Times New Roman" w:hAnsi="Times New Roman" w:cs="Times New Roman"/>
+          <w:color w:val="000000" w:themeColor="text1"/>
+        </w:rPr>
+        <w:t>{{</w:t>
+      </w:r>
+      <w:proofErr w:type="spellStart"/>
+      <w:r>
+        <w:rPr>
+          <w:rFonts w:ascii="Times New Roman" w:hAnsi="Times New Roman" w:cs="Times New Roman"/>
+          <w:color w:val="000000" w:themeColor="text1"/>
+        </w:rPr>
+        <w:t>hari</w:t>
+      </w:r>
+      <w:proofErr w:type="spellEnd"/>
+      <w:r>
+        <w:rPr>
+          <w:rFonts w:ascii="Times New Roman" w:hAnsi="Times New Roman" w:cs="Times New Roman"/>
+          <w:color w:val="000000" w:themeColor="text1"/>
+        </w:rPr>
+        <w:t xml:space="preserve">, </w:t>
+      </w:r>
+      <w:proofErr w:type="spellStart"/>
+      <w:r>
+        <w:rPr>
+          <w:rFonts w:ascii="Times New Roman" w:hAnsi="Times New Roman" w:cs="Times New Roman"/>
+          <w:color w:val="000000" w:themeColor="text1"/>
+        </w:rPr>
+        <w:t>tanggal</w:t>
+      </w:r>
+      <w:proofErr w:type="spellEnd"/>
+      <w:r>
+        <w:rPr>
+          <w:rFonts w:ascii="Times New Roman" w:hAnsi="Times New Roman" w:cs="Times New Roman"/>
+          <w:color w:val="000000" w:themeColor="text1"/>
+        </w:rPr>
+        <w:t xml:space="preserve"> </w:t>
+      </w:r>
+      <w:proofErr w:type="spellStart"/>
+      <w:r>
+        <w:rPr>
+          <w:rFonts w:ascii="Times New Roman" w:hAnsi="Times New Roman" w:cs="Times New Roman"/>
+          <w:color w:val="000000" w:themeColor="text1"/>
+        </w:rPr>
+        <w:t>bulan</w:t>
+      </w:r>
+      <w:proofErr w:type="spellEnd"/>
+      <w:r>
+        <w:rPr>
+          <w:rFonts w:ascii="Times New Roman" w:hAnsi="Times New Roman" w:cs="Times New Roman"/>
+          <w:color w:val="000000" w:themeColor="text1"/>
+        </w:rPr>
+        <w:t xml:space="preserve"> </w:t>
+      </w:r>
+      <w:proofErr w:type="spellStart"/>
+      <w:r>
+        <w:rPr>
+          <w:rFonts w:ascii="Times New Roman" w:hAnsi="Times New Roman" w:cs="Times New Roman"/>
+          <w:color w:val="000000" w:themeColor="text1"/>
+        </w:rPr>
+        <w:t>tahun</w:t>
+      </w:r>
+      <w:proofErr w:type="spellEnd"/>
+      <w:r>
+        <w:rPr>
+          <w:rFonts w:ascii="Times New Roman" w:hAnsi="Times New Roman" w:cs="Times New Roman"/>
+          <w:color w:val="000000" w:themeColor="text1"/>
+        </w:rPr>
+        <w:t>}}</w:t>
+      </w:r>
     </w:p>
     <w:p>
       <w:pPr>
@@ -2141,6 +2308,7 @@
         </w:rPr>
       </w:pPr>
     </w:p>
+    <w:bookmarkEnd w:id="0"/>
     <w:p>
       <w:pPr>
         <w:pStyle w:val="BodyText"/>
@@ -2149,24 +2317,6 @@
         <w:rPr>
           <w:rFonts w:ascii="Times New Roman" w:hAnsi="Times New Roman" w:cs="Times New Roman"/>
           <w:color w:val="000000" w:themeColor="text1"/>
-        </w:rPr>
-      </w:pPr>
-      <w:r>
-        <w:rPr>
-          <w:rFonts w:ascii="Times New Roman" w:hAnsi="Times New Roman" w:cs="Times New Roman"/>
-          <w:color w:val="000000" w:themeColor="text1"/>
-        </w:rPr>
-        <w:t>(…………………………………….)</w:t>
-      </w:r>
-    </w:p>
-    <w:p>
-      <w:pPr>
-        <w:pStyle w:val="BodyText"/>
-        <w:spacing w:before="0" w:after="0" w:line="360" w:lineRule="auto"/>
-        <w:jc w:val="center"/>
-        <w:rPr>
-          <w:rFonts w:ascii="Times New Roman" w:hAnsi="Times New Roman" w:cs="Times New Roman"/>
-          <w:color w:val="000000" w:themeColor="text1"/>
           <w:lang w:val="id-ID"/>
         </w:rPr>
       </w:pPr>
@@ -2175,16 +2325,23 @@
           <w:rFonts w:ascii="Times New Roman" w:hAnsi="Times New Roman" w:cs="Times New Roman"/>
           <w:color w:val="000000" w:themeColor="text1"/>
         </w:rPr>
-        <w:t xml:space="preserve">Nama </w:t>
-      </w:r>
-      <w:bookmarkEnd w:id="0"/>
-      <w:r>
-        <w:rPr>
-          <w:rFonts w:ascii="Times New Roman" w:hAnsi="Times New Roman" w:cs="Times New Roman"/>
-          <w:color w:val="000000" w:themeColor="text1"/>
-          <w:lang w:val="id-ID"/>
-        </w:rPr>
-        <w:t>Pelapor</w:t>
+        <w:t>{{</w:t>
+      </w:r>
+      <w:proofErr w:type="spellStart"/>
+      <w:r>
+        <w:rPr>
+          <w:rFonts w:ascii="Times New Roman" w:hAnsi="Times New Roman" w:cs="Times New Roman"/>
+          <w:color w:val="000000" w:themeColor="text1"/>
+        </w:rPr>
+        <w:t>nama_pelapor</w:t>
+      </w:r>
+      <w:proofErr w:type="spellEnd"/>
+      <w:r>
+        <w:rPr>
+          <w:rFonts w:ascii="Times New Roman" w:hAnsi="Times New Roman" w:cs="Times New Roman"/>
+          <w:color w:val="000000" w:themeColor="text1"/>
+        </w:rPr>
+        <w:t>}}</w:t>
       </w:r>
     </w:p>
     <w:sectPr>

</xml_diff>